<commit_message>
Updated Documentation and Readme file
</commit_message>
<xml_diff>
--- a/Documentation.docx
+++ b/Documentation.docx
@@ -2,7 +2,7 @@
 <file path=word/document.xml><?xml version="1.0" encoding="utf-8"?>
 <w:document xmlns:w="http://schemas.openxmlformats.org/wordprocessingml/2006/main" xmlns:m="http://schemas.openxmlformats.org/officeDocument/2006/math" xmlns:r="http://schemas.openxmlformats.org/officeDocument/2006/relationships" xmlns:o="urn:schemas-microsoft-com:office:office" xmlns:v="urn:schemas-microsoft-com:vml" xmlns:w10="urn:schemas-microsoft-com:office:word" xmlns:a="http://schemas.openxmlformats.org/drawingml/2006/main" xmlns:pic="http://schemas.openxmlformats.org/drawingml/2006/picture" xmlns:wp="http://schemas.openxmlformats.org/drawingml/2006/wordprocessingDrawing">
   <w:body>
-    <w:bookmarkStart w:id="29" w:name="ai-web-scraper"/>
+    <w:bookmarkStart w:id="33" w:name="ai-web-scraper"/>
     <w:p>
       <w:pPr>
         <w:pStyle w:val="Heading1"/>
@@ -1240,16 +1240,40 @@
       </w:pPr>
       <w:r>
         <w:rPr>
-          <w:rStyle w:val="VerbatimChar"/>
-        </w:rPr>
-        <w:t xml:space="preserve"># backend/requirements.txt</w:t>
-      </w:r>
-      <w:r>
-        <w:br/>
-      </w:r>
-      <w:r>
-        <w:rPr>
-          <w:rStyle w:val="VerbatimChar"/>
+          <w:rStyle w:val="NormalTok"/>
+        </w:rPr>
+        <w:t xml:space="preserve"># backend</w:t>
+      </w:r>
+      <w:r>
+        <w:rPr>
+          <w:rStyle w:val="OperatorTok"/>
+        </w:rPr>
+        <w:t xml:space="preserve">/</w:t>
+      </w:r>
+      <w:r>
+        <w:rPr>
+          <w:rStyle w:val="NormalTok"/>
+        </w:rPr>
+        <w:t xml:space="preserve">requirements</w:t>
+      </w:r>
+      <w:r>
+        <w:rPr>
+          <w:rStyle w:val="OperatorTok"/>
+        </w:rPr>
+        <w:t xml:space="preserve">.</w:t>
+      </w:r>
+      <w:r>
+        <w:rPr>
+          <w:rStyle w:val="AttributeTok"/>
+        </w:rPr>
+        <w:t xml:space="preserve">txt</w:t>
+      </w:r>
+      <w:r>
+        <w:br/>
+      </w:r>
+      <w:r>
+        <w:rPr>
+          <w:rStyle w:val="NormalTok"/>
         </w:rPr>
         <w:t xml:space="preserve">crawl4ai</w:t>
       </w:r>
@@ -1258,7 +1282,7 @@
       </w:r>
       <w:r>
         <w:rPr>
-          <w:rStyle w:val="VerbatimChar"/>
+          <w:rStyle w:val="NormalTok"/>
         </w:rPr>
         <w:t xml:space="preserve">openai</w:t>
       </w:r>
@@ -1267,7 +1291,7 @@
       </w:r>
       <w:r>
         <w:rPr>
-          <w:rStyle w:val="VerbatimChar"/>
+          <w:rStyle w:val="NormalTok"/>
         </w:rPr>
         <w:t xml:space="preserve">beautifulsoup4</w:t>
       </w:r>
@@ -1276,7 +1300,7 @@
       </w:r>
       <w:r>
         <w:rPr>
-          <w:rStyle w:val="VerbatimChar"/>
+          <w:rStyle w:val="NormalTok"/>
         </w:rPr>
         <w:t xml:space="preserve">httpx</w:t>
       </w:r>
@@ -1285,16 +1309,28 @@
       </w:r>
       <w:r>
         <w:rPr>
-          <w:rStyle w:val="VerbatimChar"/>
-        </w:rPr>
-        <w:t xml:space="preserve">python-dotenv</w:t>
-      </w:r>
-      <w:r>
-        <w:br/>
-      </w:r>
-      <w:r>
-        <w:rPr>
-          <w:rStyle w:val="VerbatimChar"/>
+          <w:rStyle w:val="NormalTok"/>
+        </w:rPr>
+        <w:t xml:space="preserve">python</w:t>
+      </w:r>
+      <w:r>
+        <w:rPr>
+          <w:rStyle w:val="OperatorTok"/>
+        </w:rPr>
+        <w:t xml:space="preserve">-</w:t>
+      </w:r>
+      <w:r>
+        <w:rPr>
+          <w:rStyle w:val="NormalTok"/>
+        </w:rPr>
+        <w:t xml:space="preserve">dotenv</w:t>
+      </w:r>
+      <w:r>
+        <w:br/>
+      </w:r>
+      <w:r>
+        <w:rPr>
+          <w:rStyle w:val="NormalTok"/>
         </w:rPr>
         <w:t xml:space="preserve">flask</w:t>
       </w:r>
@@ -1303,9 +1339,21 @@
       </w:r>
       <w:r>
         <w:rPr>
-          <w:rStyle w:val="VerbatimChar"/>
-        </w:rPr>
-        <w:t xml:space="preserve">flask-cors</w:t>
+          <w:rStyle w:val="NormalTok"/>
+        </w:rPr>
+        <w:t xml:space="preserve">flask</w:t>
+      </w:r>
+      <w:r>
+        <w:rPr>
+          <w:rStyle w:val="OperatorTok"/>
+        </w:rPr>
+        <w:t xml:space="preserve">-</w:t>
+      </w:r>
+      <w:r>
+        <w:rPr>
+          <w:rStyle w:val="NormalTok"/>
+        </w:rPr>
+        <w:t xml:space="preserve">cors</w:t>
       </w:r>
     </w:p>
     <w:p>
@@ -1314,45 +1362,105 @@
       </w:pPr>
       <w:r>
         <w:rPr>
-          <w:rStyle w:val="VerbatimChar"/>
-        </w:rPr>
-        <w:t xml:space="preserve"># frontend/package.json dependencies</w:t>
-      </w:r>
-      <w:r>
-        <w:br/>
-      </w:r>
-      <w:r>
-        <w:rPr>
-          <w:rStyle w:val="VerbatimChar"/>
-        </w:rPr>
-        <w:t xml:space="preserve">next 14</w:t>
-      </w:r>
-      <w:r>
-        <w:br/>
-      </w:r>
-      <w:r>
-        <w:rPr>
-          <w:rStyle w:val="VerbatimChar"/>
-        </w:rPr>
-        <w:t xml:space="preserve">react 18</w:t>
-      </w:r>
-      <w:r>
-        <w:br/>
-      </w:r>
-      <w:r>
-        <w:rPr>
-          <w:rStyle w:val="VerbatimChar"/>
-        </w:rPr>
-        <w:t xml:space="preserve">tailwindcss 3</w:t>
-      </w:r>
-      <w:r>
-        <w:br/>
-      </w:r>
-      <w:r>
-        <w:rPr>
-          <w:rStyle w:val="VerbatimChar"/>
-        </w:rPr>
-        <w:t xml:space="preserve">usehooks-ts</w:t>
+          <w:rStyle w:val="NormalTok"/>
+        </w:rPr>
+        <w:t xml:space="preserve"># frontend</w:t>
+      </w:r>
+      <w:r>
+        <w:rPr>
+          <w:rStyle w:val="OperatorTok"/>
+        </w:rPr>
+        <w:t xml:space="preserve">/</w:t>
+      </w:r>
+      <w:r>
+        <w:rPr>
+          <w:rStyle w:val="ImportTok"/>
+        </w:rPr>
+        <w:t xml:space="preserve">package</w:t>
+      </w:r>
+      <w:r>
+        <w:rPr>
+          <w:rStyle w:val="OperatorTok"/>
+        </w:rPr>
+        <w:t xml:space="preserve">.</w:t>
+      </w:r>
+      <w:r>
+        <w:rPr>
+          <w:rStyle w:val="AttributeTok"/>
+        </w:rPr>
+        <w:t xml:space="preserve">json</w:t>
+      </w:r>
+      <w:r>
+        <w:rPr>
+          <w:rStyle w:val="NormalTok"/>
+        </w:rPr>
+        <w:t xml:space="preserve"> dependencies</w:t>
+      </w:r>
+      <w:r>
+        <w:br/>
+      </w:r>
+      <w:r>
+        <w:rPr>
+          <w:rStyle w:val="NormalTok"/>
+        </w:rPr>
+        <w:t xml:space="preserve">next </w:t>
+      </w:r>
+      <w:r>
+        <w:rPr>
+          <w:rStyle w:val="DecValTok"/>
+        </w:rPr>
+        <w:t xml:space="preserve">14</w:t>
+      </w:r>
+      <w:r>
+        <w:br/>
+      </w:r>
+      <w:r>
+        <w:rPr>
+          <w:rStyle w:val="NormalTok"/>
+        </w:rPr>
+        <w:t xml:space="preserve">react </w:t>
+      </w:r>
+      <w:r>
+        <w:rPr>
+          <w:rStyle w:val="DecValTok"/>
+        </w:rPr>
+        <w:t xml:space="preserve">18</w:t>
+      </w:r>
+      <w:r>
+        <w:br/>
+      </w:r>
+      <w:r>
+        <w:rPr>
+          <w:rStyle w:val="NormalTok"/>
+        </w:rPr>
+        <w:t xml:space="preserve">tailwindcss </w:t>
+      </w:r>
+      <w:r>
+        <w:rPr>
+          <w:rStyle w:val="DecValTok"/>
+        </w:rPr>
+        <w:t xml:space="preserve">3</w:t>
+      </w:r>
+      <w:r>
+        <w:br/>
+      </w:r>
+      <w:r>
+        <w:rPr>
+          <w:rStyle w:val="NormalTok"/>
+        </w:rPr>
+        <w:t xml:space="preserve">usehooks</w:t>
+      </w:r>
+      <w:r>
+        <w:rPr>
+          <w:rStyle w:val="OperatorTok"/>
+        </w:rPr>
+        <w:t xml:space="preserve">-</w:t>
+      </w:r>
+      <w:r>
+        <w:rPr>
+          <w:rStyle w:val="NormalTok"/>
+        </w:rPr>
+        <w:t xml:space="preserve">ts</w:t>
       </w:r>
     </w:p>
     <w:p>
@@ -1525,7 +1633,7 @@
       </w:r>
     </w:p>
     <w:bookmarkEnd w:id="27"/>
-    <w:bookmarkStart w:id="28" w:name="known-limitations"/>
+    <w:bookmarkStart w:id="32" w:name="known-limitations"/>
     <w:p>
       <w:pPr>
         <w:pStyle w:val="Heading2"/>
@@ -1542,8 +1650,231 @@
         <w:t xml:space="preserve">Sites like Amazon block headless browsers regardless of stealth settings. ScrapingBee handles this but costs credits. The LLM extraction is only as good as the page content — if the site renders data entirely in JavaScript after interaction (infinite scroll, click-to-load), Crawl4AI may not capture it without custom JavaScript injection. The n8n workflow has a disconnected response node for the homepage-sufficient path which is a known bug in the exported workflow.</w:t>
       </w:r>
     </w:p>
+    <w:bookmarkStart w:id="28" w:name="X39e477a65f23319075feb5be0e838c38cee722e"/>
+    <w:p>
+      <w:pPr>
+        <w:pStyle w:val="Heading3"/>
+      </w:pPr>
+      <w:r>
+        <w:t xml:space="preserve">Current Implementation: The Generalized Approach</w:t>
+      </w:r>
+    </w:p>
+    <w:p>
+      <w:pPr>
+        <w:pStyle w:val="FirstParagraph"/>
+      </w:pPr>
+      <w:r>
+        <w:t xml:space="preserve">To achieve a highly adaptable and</w:t>
+      </w:r>
+      <w:r>
+        <w:t xml:space="preserve"> </w:t>
+      </w:r>
+      <w:r>
+        <w:t xml:space="preserve">“</w:t>
+      </w:r>
+      <w:r>
+        <w:t xml:space="preserve">generalized</w:t>
+      </w:r>
+      <w:r>
+        <w:t xml:space="preserve">”</w:t>
+      </w:r>
+      <w:r>
+        <w:t xml:space="preserve"> </w:t>
+      </w:r>
+      <w:r>
+        <w:t xml:space="preserve">scraping architecture capable of navigating diverse website structures, this project implements a dual-approach:</w:t>
+      </w:r>
+    </w:p>
+    <w:p>
+      <w:pPr>
+        <w:pStyle w:val="Compact"/>
+        <w:numPr>
+          <w:ilvl w:val="0"/>
+          <w:numId w:val="1001"/>
+        </w:numPr>
+      </w:pPr>
+      <w:r>
+        <w:rPr>
+          <w:b/>
+          <w:bCs/>
+        </w:rPr>
+        <w:t xml:space="preserve">Crawl4AI:</w:t>
+      </w:r>
+      <w:r>
+        <w:t xml:space="preserve"> </w:t>
+      </w:r>
+      <w:r>
+        <w:t xml:space="preserve">Leveraging its advanced browser configuration (Stealth Mode, Managed Browsers) and LLM-driven extraction to handle dynamic content and initial bot detection.</w:t>
+      </w:r>
+    </w:p>
+    <w:p>
+      <w:pPr>
+        <w:pStyle w:val="Compact"/>
+        <w:numPr>
+          <w:ilvl w:val="0"/>
+          <w:numId w:val="1001"/>
+        </w:numPr>
+      </w:pPr>
+      <w:r>
+        <w:rPr>
+          <w:b/>
+          <w:bCs/>
+        </w:rPr>
+        <w:t xml:space="preserve">n8n Automation:</w:t>
+      </w:r>
+      <w:r>
+        <w:t xml:space="preserve"> </w:t>
+      </w:r>
+      <w:r>
+        <w:t xml:space="preserve">Used for workflow orchestration, URL filtering, and logic-based data processing.</w:t>
+      </w:r>
+    </w:p>
     <w:bookmarkEnd w:id="28"/>
+    <w:bookmarkStart w:id="29" w:name="challenges-captcha-anti-bot-protection"/>
+    <w:p>
+      <w:pPr>
+        <w:pStyle w:val="Heading3"/>
+      </w:pPr>
+      <w:r>
+        <w:t xml:space="preserve">Challenges: Captcha &amp; Anti-Bot Protection</w:t>
+      </w:r>
+    </w:p>
+    <w:p>
+      <w:pPr>
+        <w:pStyle w:val="FirstParagraph"/>
+      </w:pPr>
+      <w:r>
+        <w:t xml:space="preserve">Standard scraping often encounters friction from dynamic Captchas and sophisticated anti-bot shields (e.g., Cloudflare, Akamai). While the current setup maximizes stealth via fingerprinting, these remain significant hurdles for fully automated systems.</w:t>
+      </w:r>
+    </w:p>
     <w:bookmarkEnd w:id="29"/>
+    <w:bookmarkStart w:id="30" w:name="future-roadmap-advanced-bypass-scaling"/>
+    <w:p>
+      <w:pPr>
+        <w:pStyle w:val="Heading3"/>
+      </w:pPr>
+      <w:r>
+        <w:t xml:space="preserve">Future Roadmap: Advanced Bypass &amp; Scaling</w:t>
+      </w:r>
+    </w:p>
+    <w:p>
+      <w:pPr>
+        <w:pStyle w:val="FirstParagraph"/>
+      </w:pPr>
+      <w:r>
+        <w:t xml:space="preserve">To further harden the automation against aggressive IP blocking and rotating protection, the following integrations are considered for future development:</w:t>
+      </w:r>
+    </w:p>
+    <w:p>
+      <w:pPr>
+        <w:pStyle w:val="Compact"/>
+        <w:numPr>
+          <w:ilvl w:val="0"/>
+          <w:numId w:val="1002"/>
+        </w:numPr>
+      </w:pPr>
+      <w:r>
+        <w:rPr>
+          <w:b/>
+          <w:bCs/>
+        </w:rPr>
+        <w:t xml:space="preserve">ScrapingBee / Specialized APIs:</w:t>
+      </w:r>
+      <w:r>
+        <w:t xml:space="preserve"> </w:t>
+      </w:r>
+      <w:r>
+        <w:t xml:space="preserve">To offload headless browser management and automated proxy rotation specifically to solve Captchas at scale.</w:t>
+      </w:r>
+    </w:p>
+    <w:p>
+      <w:pPr>
+        <w:pStyle w:val="Compact"/>
+        <w:numPr>
+          <w:ilvl w:val="0"/>
+          <w:numId w:val="1002"/>
+        </w:numPr>
+      </w:pPr>
+      <w:r>
+        <w:rPr>
+          <w:b/>
+          <w:bCs/>
+        </w:rPr>
+        <w:t xml:space="preserve">Firecrawl / AI Crawlers:</w:t>
+      </w:r>
+      <w:r>
+        <w:t xml:space="preserve"> </w:t>
+      </w:r>
+      <w:r>
+        <w:t xml:space="preserve">Transitioning toward AI-native crawling engines designed to normalize data from anti-IP rotating websites.</w:t>
+      </w:r>
+    </w:p>
+    <w:bookmarkEnd w:id="30"/>
+    <w:bookmarkStart w:id="31" w:name="why-crawl4ai-n8n"/>
+    <w:p>
+      <w:pPr>
+        <w:pStyle w:val="Heading3"/>
+      </w:pPr>
+      <w:r>
+        <w:t xml:space="preserve">Why Crawl4AI + n8n?</w:t>
+      </w:r>
+    </w:p>
+    <w:p>
+      <w:pPr>
+        <w:pStyle w:val="FirstParagraph"/>
+      </w:pPr>
+      <w:r>
+        <w:t xml:space="preserve">For this specific project phase, the combination of</w:t>
+      </w:r>
+      <w:r>
+        <w:t xml:space="preserve"> </w:t>
+      </w:r>
+      <w:r>
+        <w:rPr>
+          <w:b/>
+          <w:bCs/>
+        </w:rPr>
+        <w:t xml:space="preserve">Crawl4AI</w:t>
+      </w:r>
+      <w:r>
+        <w:t xml:space="preserve"> </w:t>
+      </w:r>
+      <w:r>
+        <w:t xml:space="preserve">and</w:t>
+      </w:r>
+      <w:r>
+        <w:t xml:space="preserve"> </w:t>
+      </w:r>
+      <w:r>
+        <w:rPr>
+          <w:b/>
+          <w:bCs/>
+        </w:rPr>
+        <w:t xml:space="preserve">n8n</w:t>
+      </w:r>
+      <w:r>
+        <w:t xml:space="preserve"> </w:t>
+      </w:r>
+      <w:r>
+        <w:t xml:space="preserve">was selected as the optimal path to create a</w:t>
+      </w:r>
+      <w:r>
+        <w:t xml:space="preserve"> </w:t>
+      </w:r>
+      <w:r>
+        <w:rPr>
+          <w:b/>
+          <w:bCs/>
+        </w:rPr>
+        <w:t xml:space="preserve">Generalized Scraper</w:t>
+      </w:r>
+      <w:r>
+        <w:t xml:space="preserve">. This stack provides the right balance of browser-level control and low-code orchestration to extract useful data from most websites without the high overhead of specialized third-party services.</w:t>
+      </w:r>
+    </w:p>
+    <w:bookmarkEnd w:id="31"/>
+    <w:bookmarkEnd w:id="32"/>
+    <w:bookmarkEnd w:id="33"/>
     <w:sectPr/>
   </w:body>
 </w:document>
@@ -1650,8 +1981,90 @@
       </w:pPr>
     </w:lvl>
   </w:abstractNum>
+  <w:abstractNum w:abstractNumId="991">
+    <w:nsid w:val="0000A991"/>
+    <w:multiLevelType w:val="multilevel"/>
+    <w:lvl w:ilvl="0">
+      <w:numFmt w:val="bullet"/>
+      <w:lvlText w:val="•"/>
+      <w:lvlJc w:val="left"/>
+      <w:pPr>
+        <w:ind w:left="720" w:hanging="480"/>
+      </w:pPr>
+    </w:lvl>
+    <w:lvl w:ilvl="1">
+      <w:numFmt w:val="bullet"/>
+      <w:lvlText w:val="–"/>
+      <w:lvlJc w:val="left"/>
+      <w:pPr>
+        <w:ind w:left="1440" w:hanging="480"/>
+      </w:pPr>
+    </w:lvl>
+    <w:lvl w:ilvl="2">
+      <w:numFmt w:val="bullet"/>
+      <w:lvlText w:val="•"/>
+      <w:lvlJc w:val="left"/>
+      <w:pPr>
+        <w:ind w:left="2160" w:hanging="480"/>
+      </w:pPr>
+    </w:lvl>
+    <w:lvl w:ilvl="3">
+      <w:numFmt w:val="bullet"/>
+      <w:lvlText w:val="–"/>
+      <w:lvlJc w:val="left"/>
+      <w:pPr>
+        <w:ind w:left="2880" w:hanging="480"/>
+      </w:pPr>
+    </w:lvl>
+    <w:lvl w:ilvl="4">
+      <w:numFmt w:val="bullet"/>
+      <w:lvlText w:val="•"/>
+      <w:lvlJc w:val="left"/>
+      <w:pPr>
+        <w:ind w:left="3600" w:hanging="480"/>
+      </w:pPr>
+    </w:lvl>
+    <w:lvl w:ilvl="5">
+      <w:numFmt w:val="bullet"/>
+      <w:lvlText w:val="–"/>
+      <w:lvlJc w:val="left"/>
+      <w:pPr>
+        <w:ind w:left="4320" w:hanging="480"/>
+      </w:pPr>
+    </w:lvl>
+    <w:lvl w:ilvl="6">
+      <w:numFmt w:val="bullet"/>
+      <w:lvlText w:val="•"/>
+      <w:lvlJc w:val="left"/>
+      <w:pPr>
+        <w:ind w:left="5040" w:hanging="480"/>
+      </w:pPr>
+    </w:lvl>
+    <w:lvl w:ilvl="7">
+      <w:numFmt w:val="bullet"/>
+      <w:lvlText w:val="–"/>
+      <w:lvlJc w:val="left"/>
+      <w:pPr>
+        <w:ind w:left="5760" w:hanging="480"/>
+      </w:pPr>
+    </w:lvl>
+    <w:lvl w:ilvl="8">
+      <w:numFmt w:val="bullet"/>
+      <w:lvlText w:val="•"/>
+      <w:lvlJc w:val="left"/>
+      <w:pPr>
+        <w:ind w:left="6480" w:hanging="480"/>
+      </w:pPr>
+    </w:lvl>
+  </w:abstractNum>
   <w:num w:numId="1000">
     <w:abstractNumId w:val="990"/>
+  </w:num>
+  <w:num w:numId="1001">
+    <w:abstractNumId w:val="991"/>
+  </w:num>
+  <w:num w:numId="1002">
+    <w:abstractNumId w:val="991"/>
   </w:num>
 </w:numbering>
 </file>

</xml_diff>